<commit_message>
fix: split package table into 3 columns (Package | Versi | Fungsi) and remove caret symbols
</commit_message>
<xml_diff>
--- a/Laporan_UAS_Lognity.docx
+++ b/Laporan_UAS_Lognity.docx
@@ -339,13 +339,14 @@
         <w:tblLook w:firstColumn="1" w:firstRow="1" w:lastColumn="0" w:lastRow="0" w:noHBand="0" w:noVBand="1" w:val="04A0"/>
       </w:tblPr>
       <w:tblGrid>
-        <w:gridCol w:w="4320"/>
-        <w:gridCol w:w="4320"/>
+        <w:gridCol w:w="2880"/>
+        <w:gridCol w:w="2880"/>
+        <w:gridCol w:w="2880"/>
       </w:tblGrid>
       <w:tr>
         <w:tc>
           <w:tcPr>
-            <w:tcW w:type="dxa" w:w="4320"/>
+            <w:tcW w:type="dxa" w:w="2880"/>
           </w:tcPr>
           <w:p>
             <w:r>
@@ -358,7 +359,20 @@
         </w:tc>
         <w:tc>
           <w:tcPr>
-            <w:tcW w:type="dxa" w:w="4320"/>
+            <w:tcW w:type="dxa" w:w="2880"/>
+          </w:tcPr>
+          <w:p>
+            <w:r>
+              <w:rPr>
+                <w:b/>
+              </w:rPr>
+              <w:t>Versi</w:t>
+            </w:r>
+          </w:p>
+        </w:tc>
+        <w:tc>
+          <w:tcPr>
+            <w:tcW w:type="dxa" w:w="2880"/>
           </w:tcPr>
           <w:p>
             <w:r>
@@ -373,17 +387,27 @@
       <w:tr>
         <w:tc>
           <w:tcPr>
-            <w:tcW w:type="dxa" w:w="4320"/>
+            <w:tcW w:type="dxa" w:w="2880"/>
           </w:tcPr>
           <w:p>
             <w:r>
-              <w:t>cupertino_icons: ^1.0.8</w:t>
+              <w:t>cupertino_icons</w:t>
             </w:r>
           </w:p>
         </w:tc>
         <w:tc>
           <w:tcPr>
-            <w:tcW w:type="dxa" w:w="4320"/>
+            <w:tcW w:type="dxa" w:w="2880"/>
+          </w:tcPr>
+          <w:p>
+            <w:r>
+              <w:t>1.0.8</w:t>
+            </w:r>
+          </w:p>
+        </w:tc>
+        <w:tc>
+          <w:tcPr>
+            <w:tcW w:type="dxa" w:w="2880"/>
           </w:tcPr>
           <w:p>
             <w:r>
@@ -395,17 +419,27 @@
       <w:tr>
         <w:tc>
           <w:tcPr>
-            <w:tcW w:type="dxa" w:w="4320"/>
+            <w:tcW w:type="dxa" w:w="2880"/>
           </w:tcPr>
           <w:p>
             <w:r>
-              <w:t>http: ^1.6.0</w:t>
+              <w:t>http</w:t>
             </w:r>
           </w:p>
         </w:tc>
         <w:tc>
           <w:tcPr>
-            <w:tcW w:type="dxa" w:w="4320"/>
+            <w:tcW w:type="dxa" w:w="2880"/>
+          </w:tcPr>
+          <w:p>
+            <w:r>
+              <w:t>1.6.0</w:t>
+            </w:r>
+          </w:p>
+        </w:tc>
+        <w:tc>
+          <w:tcPr>
+            <w:tcW w:type="dxa" w:w="2880"/>
           </w:tcPr>
           <w:p>
             <w:r>
@@ -417,17 +451,27 @@
       <w:tr>
         <w:tc>
           <w:tcPr>
-            <w:tcW w:type="dxa" w:w="4320"/>
+            <w:tcW w:type="dxa" w:w="2880"/>
           </w:tcPr>
           <w:p>
             <w:r>
-              <w:t>provider: ^6.1.5+1</w:t>
+              <w:t>provider</w:t>
             </w:r>
           </w:p>
         </w:tc>
         <w:tc>
           <w:tcPr>
-            <w:tcW w:type="dxa" w:w="4320"/>
+            <w:tcW w:type="dxa" w:w="2880"/>
+          </w:tcPr>
+          <w:p>
+            <w:r>
+              <w:t>6.1.5+1</w:t>
+            </w:r>
+          </w:p>
+        </w:tc>
+        <w:tc>
+          <w:tcPr>
+            <w:tcW w:type="dxa" w:w="2880"/>
           </w:tcPr>
           <w:p>
             <w:r>
@@ -439,17 +483,27 @@
       <w:tr>
         <w:tc>
           <w:tcPr>
-            <w:tcW w:type="dxa" w:w="4320"/>
+            <w:tcW w:type="dxa" w:w="2880"/>
           </w:tcPr>
           <w:p>
             <w:r>
-              <w:t>shared_preferences: ^2.5.5</w:t>
+              <w:t>shared_preferences</w:t>
             </w:r>
           </w:p>
         </w:tc>
         <w:tc>
           <w:tcPr>
-            <w:tcW w:type="dxa" w:w="4320"/>
+            <w:tcW w:type="dxa" w:w="2880"/>
+          </w:tcPr>
+          <w:p>
+            <w:r>
+              <w:t>2.5.5</w:t>
+            </w:r>
+          </w:p>
+        </w:tc>
+        <w:tc>
+          <w:tcPr>
+            <w:tcW w:type="dxa" w:w="2880"/>
           </w:tcPr>
           <w:p>
             <w:r>
@@ -461,17 +515,27 @@
       <w:tr>
         <w:tc>
           <w:tcPr>
-            <w:tcW w:type="dxa" w:w="4320"/>
+            <w:tcW w:type="dxa" w:w="2880"/>
           </w:tcPr>
           <w:p>
             <w:r>
-              <w:t>url_launcher: ^6.3.2</w:t>
+              <w:t>url_launcher</w:t>
             </w:r>
           </w:p>
         </w:tc>
         <w:tc>
           <w:tcPr>
-            <w:tcW w:type="dxa" w:w="4320"/>
+            <w:tcW w:type="dxa" w:w="2880"/>
+          </w:tcPr>
+          <w:p>
+            <w:r>
+              <w:t>6.3.2</w:t>
+            </w:r>
+          </w:p>
+        </w:tc>
+        <w:tc>
+          <w:tcPr>
+            <w:tcW w:type="dxa" w:w="2880"/>
           </w:tcPr>
           <w:p>
             <w:r>
@@ -483,17 +547,27 @@
       <w:tr>
         <w:tc>
           <w:tcPr>
-            <w:tcW w:type="dxa" w:w="4320"/>
+            <w:tcW w:type="dxa" w:w="2880"/>
           </w:tcPr>
           <w:p>
             <w:r>
-              <w:t>file_picker: ^11.0.2</w:t>
+              <w:t>file_picker</w:t>
             </w:r>
           </w:p>
         </w:tc>
         <w:tc>
           <w:tcPr>
-            <w:tcW w:type="dxa" w:w="4320"/>
+            <w:tcW w:type="dxa" w:w="2880"/>
+          </w:tcPr>
+          <w:p>
+            <w:r>
+              <w:t>11.0.2</w:t>
+            </w:r>
+          </w:p>
+        </w:tc>
+        <w:tc>
+          <w:tcPr>
+            <w:tcW w:type="dxa" w:w="2880"/>
           </w:tcPr>
           <w:p>
             <w:r>
@@ -505,17 +579,27 @@
       <w:tr>
         <w:tc>
           <w:tcPr>
-            <w:tcW w:type="dxa" w:w="4320"/>
+            <w:tcW w:type="dxa" w:w="2880"/>
           </w:tcPr>
           <w:p>
             <w:r>
-              <w:t>google_fonts: ^6.2.1</w:t>
+              <w:t>google_fonts</w:t>
             </w:r>
           </w:p>
         </w:tc>
         <w:tc>
           <w:tcPr>
-            <w:tcW w:type="dxa" w:w="4320"/>
+            <w:tcW w:type="dxa" w:w="2880"/>
+          </w:tcPr>
+          <w:p>
+            <w:r>
+              <w:t>6.2.1</w:t>
+            </w:r>
+          </w:p>
+        </w:tc>
+        <w:tc>
+          <w:tcPr>
+            <w:tcW w:type="dxa" w:w="2880"/>
           </w:tcPr>
           <w:p>
             <w:r>
@@ -527,17 +611,27 @@
       <w:tr>
         <w:tc>
           <w:tcPr>
-            <w:tcW w:type="dxa" w:w="4320"/>
+            <w:tcW w:type="dxa" w:w="2880"/>
           </w:tcPr>
           <w:p>
             <w:r>
-              <w:t>flutter_svg: ^2.0.10</w:t>
+              <w:t>flutter_svg</w:t>
             </w:r>
           </w:p>
         </w:tc>
         <w:tc>
           <w:tcPr>
-            <w:tcW w:type="dxa" w:w="4320"/>
+            <w:tcW w:type="dxa" w:w="2880"/>
+          </w:tcPr>
+          <w:p>
+            <w:r>
+              <w:t>2.0.10</w:t>
+            </w:r>
+          </w:p>
+        </w:tc>
+        <w:tc>
+          <w:tcPr>
+            <w:tcW w:type="dxa" w:w="2880"/>
           </w:tcPr>
           <w:p>
             <w:r>

</xml_diff>